<commit_message>
revert: 'consisting of' scope list only on gas regen offers, not oil
Removed the cover-letter scope list from the oil template; kept it on the gas
template.

Co-Authored-By: Claude Opus 4.8 (1M context) <noreply@anthropic.com>
</commit_message>
<xml_diff>
--- a/Regen_Oil_Offer_Template.docx
+++ b/Regen_Oil_Offer_Template.docx
@@ -641,65 +641,6 @@
           <w:rFonts w:ascii="Calibri" w:cs="Calibri" w:eastAsia="Calibri" w:hAnsi="Calibri"/>
         </w:rPr>
         <w:t>We are pleased to enclose herewith our most competitive and comprehensive offer for the same for your kind perusal.</w:t>
-      </w:r>
-    </w:p>
-    <w:p>
-      <w:pPr>
-        <w:spacing w:after="60" w:before="0" w:line="240" w:lineRule="auto"/>
-        <w:jc w:val="left"/>
-      </w:pPr>
-      <w:r>
-        <w:t>The offer broadly comprises the following:</w:t>
-      </w:r>
-    </w:p>
-    <w:p>
-      <w:pPr>
-        <w:spacing w:after="20" w:before="0" w:line="240" w:lineRule="auto"/>
-        <w:ind w:left="504"/>
-        <w:jc w:val="left"/>
-      </w:pPr>
-      <w:r>
-        <w:t>1. Regenerative Burners</w:t>
-      </w:r>
-    </w:p>
-    <w:p>
-      <w:pPr>
-        <w:spacing w:after="20" w:before="0" w:line="240" w:lineRule="auto"/>
-        <w:ind w:left="504"/>
-        <w:jc w:val="left"/>
-      </w:pPr>
-      <w:r>
-        <w:t>2. Temperature Control</w:t>
-      </w:r>
-    </w:p>
-    <w:p>
-      <w:pPr>
-        <w:spacing w:after="20" w:before="0" w:line="240" w:lineRule="auto"/>
-        <w:ind w:left="504"/>
-        <w:jc w:val="left"/>
-      </w:pPr>
-      <w:r>
-        <w:t>3. Blower for Combustion Air</w:t>
-      </w:r>
-    </w:p>
-    <w:p>
-      <w:pPr>
-        <w:spacing w:after="20" w:before="0" w:line="240" w:lineRule="auto"/>
-        <w:ind w:left="504"/>
-        <w:jc w:val="left"/>
-      </w:pPr>
-      <w:r>
-        <w:t>4. ID Fan for Suction of Flue Gas</w:t>
-      </w:r>
-    </w:p>
-    <w:p>
-      <w:pPr>
-        <w:spacing w:after="20" w:before="0" w:line="240" w:lineRule="auto"/>
-        <w:ind w:left="504"/>
-        <w:jc w:val="left"/>
-      </w:pPr>
-      <w:r>
-        <w:t>5. Panel with PLC &amp; HMI</w:t>
       </w:r>
     </w:p>
     <w:p>

</xml_diff>